<commit_message>
refactor: remove old dashboard architecture
</commit_message>
<xml_diff>
--- a/TradeXpert.docx
+++ b/TradeXpert.docx
@@ -44,7 +44,7 @@
     <w:p>
       <w:r>
         <w:pict w14:anchorId="5C139307">
-          <v:rect id="_x0000_i1175" style="width:0;height:1.5pt" o:hralign="center" o:hrstd="t" o:hr="t" fillcolor="#a0a0a0" stroked="f"/>
+          <v:rect id="_x0000_i1025" style="width:0;height:1.5pt" o:hralign="center" o:hrstd="t" o:hr="t" fillcolor="#a0a0a0" stroked="f"/>
         </w:pict>
       </w:r>
     </w:p>
@@ -239,7 +239,7 @@
     <w:p>
       <w:r>
         <w:pict w14:anchorId="75FC5852">
-          <v:rect id="_x0000_i1176" style="width:0;height:1.5pt" o:hralign="center" o:hrstd="t" o:hr="t" fillcolor="#a0a0a0" stroked="f"/>
+          <v:rect id="_x0000_i1026" style="width:0;height:1.5pt" o:hralign="center" o:hrstd="t" o:hr="t" fillcolor="#a0a0a0" stroked="f"/>
         </w:pict>
       </w:r>
     </w:p>
@@ -321,7 +321,7 @@
     <w:p>
       <w:r>
         <w:pict w14:anchorId="6CD52764">
-          <v:rect id="_x0000_i1177" style="width:0;height:1.5pt" o:hralign="center" o:hrstd="t" o:hr="t" fillcolor="#a0a0a0" stroked="f"/>
+          <v:rect id="_x0000_i1027" style="width:0;height:1.5pt" o:hralign="center" o:hrstd="t" o:hr="t" fillcolor="#a0a0a0" stroked="f"/>
         </w:pict>
       </w:r>
     </w:p>
@@ -348,7 +348,7 @@
     <w:p>
       <w:r>
         <w:pict w14:anchorId="48550CDB">
-          <v:rect id="_x0000_i1178" style="width:0;height:1.5pt" o:hralign="center" o:hrstd="t" o:hr="t" fillcolor="#a0a0a0" stroked="f"/>
+          <v:rect id="_x0000_i1028" style="width:0;height:1.5pt" o:hralign="center" o:hrstd="t" o:hr="t" fillcolor="#a0a0a0" stroked="f"/>
         </w:pict>
       </w:r>
     </w:p>
@@ -447,7 +447,7 @@
     <w:p>
       <w:r>
         <w:pict w14:anchorId="01DB0C32">
-          <v:rect id="_x0000_i1179" style="width:0;height:1.5pt" o:hralign="center" o:hrstd="t" o:hr="t" fillcolor="#a0a0a0" stroked="f"/>
+          <v:rect id="_x0000_i1029" style="width:0;height:1.5pt" o:hralign="center" o:hrstd="t" o:hr="t" fillcolor="#a0a0a0" stroked="f"/>
         </w:pict>
       </w:r>
     </w:p>
@@ -536,7 +536,7 @@
     <w:p>
       <w:r>
         <w:pict w14:anchorId="4B6F9D73">
-          <v:rect id="_x0000_i1180" style="width:0;height:1.5pt" o:hralign="center" o:hrstd="t" o:hr="t" fillcolor="#a0a0a0" stroked="f"/>
+          <v:rect id="_x0000_i1030" style="width:0;height:1.5pt" o:hralign="center" o:hrstd="t" o:hr="t" fillcolor="#a0a0a0" stroked="f"/>
         </w:pict>
       </w:r>
     </w:p>
@@ -603,7 +603,7 @@
     <w:p>
       <w:r>
         <w:pict w14:anchorId="13F822F8">
-          <v:rect id="_x0000_i1181" style="width:0;height:1.5pt" o:hralign="center" o:hrstd="t" o:hr="t" fillcolor="#a0a0a0" stroked="f"/>
+          <v:rect id="_x0000_i1031" style="width:0;height:1.5pt" o:hralign="center" o:hrstd="t" o:hr="t" fillcolor="#a0a0a0" stroked="f"/>
         </w:pict>
       </w:r>
     </w:p>
@@ -669,7 +669,7 @@
     <w:p>
       <w:r>
         <w:pict w14:anchorId="31623493">
-          <v:rect id="_x0000_i1182" style="width:0;height:1.5pt" o:hralign="center" o:hrstd="t" o:hr="t" fillcolor="#a0a0a0" stroked="f"/>
+          <v:rect id="_x0000_i1032" style="width:0;height:1.5pt" o:hralign="center" o:hrstd="t" o:hr="t" fillcolor="#a0a0a0" stroked="f"/>
         </w:pict>
       </w:r>
     </w:p>
@@ -735,7 +735,7 @@
     <w:p>
       <w:r>
         <w:pict w14:anchorId="1F87B2E3">
-          <v:rect id="_x0000_i1183" style="width:0;height:1.5pt" o:hralign="center" o:hrstd="t" o:hr="t" fillcolor="#a0a0a0" stroked="f"/>
+          <v:rect id="_x0000_i1033" style="width:0;height:1.5pt" o:hralign="center" o:hrstd="t" o:hr="t" fillcolor="#a0a0a0" stroked="f"/>
         </w:pict>
       </w:r>
     </w:p>
@@ -798,7 +798,7 @@
     <w:p>
       <w:r>
         <w:pict w14:anchorId="33E66CE2">
-          <v:rect id="_x0000_i1184" style="width:0;height:1.5pt" o:hralign="center" o:hrstd="t" o:hr="t" fillcolor="#a0a0a0" stroked="f"/>
+          <v:rect id="_x0000_i1034" style="width:0;height:1.5pt" o:hralign="center" o:hrstd="t" o:hr="t" fillcolor="#a0a0a0" stroked="f"/>
         </w:pict>
       </w:r>
     </w:p>
@@ -887,7 +887,7 @@
       <w:r>
         <w:lastRenderedPageBreak/>
         <w:pict w14:anchorId="29EBD958">
-          <v:rect id="_x0000_i1185" style="width:0;height:1.5pt" o:hralign="center" o:hrstd="t" o:hr="t" fillcolor="#a0a0a0" stroked="f"/>
+          <v:rect id="_x0000_i1035" style="width:0;height:1.5pt" o:hralign="center" o:hrstd="t" o:hr="t" fillcolor="#a0a0a0" stroked="f"/>
         </w:pict>
       </w:r>
     </w:p>
@@ -1032,7 +1032,7 @@
     <w:p>
       <w:r>
         <w:pict w14:anchorId="57FDC422">
-          <v:rect id="_x0000_i1186" style="width:0;height:1.5pt" o:hralign="center" o:hrstd="t" o:hr="t" fillcolor="#a0a0a0" stroked="f"/>
+          <v:rect id="_x0000_i1036" style="width:0;height:1.5pt" o:hralign="center" o:hrstd="t" o:hr="t" fillcolor="#a0a0a0" stroked="f"/>
         </w:pict>
       </w:r>
     </w:p>
@@ -1166,7 +1166,7 @@
     <w:p>
       <w:r>
         <w:pict w14:anchorId="3D5A2AE9">
-          <v:rect id="_x0000_i1187" style="width:0;height:1.5pt" o:hralign="center" o:hrstd="t" o:hr="t" fillcolor="#a0a0a0" stroked="f"/>
+          <v:rect id="_x0000_i1037" style="width:0;height:1.5pt" o:hralign="center" o:hrstd="t" o:hr="t" fillcolor="#a0a0a0" stroked="f"/>
         </w:pict>
       </w:r>
     </w:p>
@@ -1222,7 +1222,7 @@
     <w:p>
       <w:r>
         <w:pict w14:anchorId="472D0F53">
-          <v:rect id="_x0000_i1188" style="width:0;height:1.5pt" o:hralign="center" o:hrstd="t" o:hr="t" fillcolor="#a0a0a0" stroked="f"/>
+          <v:rect id="_x0000_i1038" style="width:0;height:1.5pt" o:hralign="center" o:hrstd="t" o:hr="t" fillcolor="#a0a0a0" stroked="f"/>
         </w:pict>
       </w:r>
     </w:p>
@@ -1298,7 +1298,7 @@
     <w:p>
       <w:r>
         <w:pict w14:anchorId="26B1C576">
-          <v:rect id="_x0000_i1189" style="width:0;height:1.5pt" o:hralign="center" o:hrstd="t" o:hr="t" fillcolor="#a0a0a0" stroked="f"/>
+          <v:rect id="_x0000_i1039" style="width:0;height:1.5pt" o:hralign="center" o:hrstd="t" o:hr="t" fillcolor="#a0a0a0" stroked="f"/>
         </w:pict>
       </w:r>
     </w:p>
@@ -1395,7 +1395,7 @@
     <w:p>
       <w:r>
         <w:pict w14:anchorId="0CF0FF56">
-          <v:rect id="_x0000_i1190" style="width:0;height:1.5pt" o:hralign="center" o:hrstd="t" o:hr="t" fillcolor="#a0a0a0" stroked="f"/>
+          <v:rect id="_x0000_i1040" style="width:0;height:1.5pt" o:hralign="center" o:hrstd="t" o:hr="t" fillcolor="#a0a0a0" stroked="f"/>
         </w:pict>
       </w:r>
     </w:p>
@@ -1488,7 +1488,7 @@
     <w:p>
       <w:r>
         <w:pict w14:anchorId="148033F4">
-          <v:rect id="_x0000_i1191" style="width:0;height:1.5pt" o:hralign="center" o:hrstd="t" o:hr="t" fillcolor="#a0a0a0" stroked="f"/>
+          <v:rect id="_x0000_i1041" style="width:0;height:1.5pt" o:hralign="center" o:hrstd="t" o:hr="t" fillcolor="#a0a0a0" stroked="f"/>
         </w:pict>
       </w:r>
     </w:p>
@@ -1521,7 +1521,7 @@
     <w:p>
       <w:r>
         <w:pict w14:anchorId="1555C37A">
-          <v:rect id="_x0000_i1192" style="width:0;height:1.5pt" o:hralign="center" o:hrstd="t" o:hr="t" fillcolor="#a0a0a0" stroked="f"/>
+          <v:rect id="_x0000_i1042" style="width:0;height:1.5pt" o:hralign="center" o:hrstd="t" o:hr="t" fillcolor="#a0a0a0" stroked="f"/>
         </w:pict>
       </w:r>
     </w:p>
@@ -1598,7 +1598,7 @@
     <w:p>
       <w:r>
         <w:pict w14:anchorId="1638DCC4">
-          <v:rect id="_x0000_i1193" style="width:0;height:1.5pt" o:hralign="center" o:hrstd="t" o:hr="t" fillcolor="#a0a0a0" stroked="f"/>
+          <v:rect id="_x0000_i1043" style="width:0;height:1.5pt" o:hralign="center" o:hrstd="t" o:hr="t" fillcolor="#a0a0a0" stroked="f"/>
         </w:pict>
       </w:r>
     </w:p>
@@ -1657,7 +1657,7 @@
     <w:p>
       <w:r>
         <w:pict w14:anchorId="1E79FC95">
-          <v:rect id="_x0000_i1194" style="width:0;height:1.5pt" o:hralign="center" o:hrstd="t" o:hr="t" fillcolor="#a0a0a0" stroked="f"/>
+          <v:rect id="_x0000_i1044" style="width:0;height:1.5pt" o:hralign="center" o:hrstd="t" o:hr="t" fillcolor="#a0a0a0" stroked="f"/>
         </w:pict>
       </w:r>
     </w:p>
@@ -1978,7 +1978,7 @@
     <w:p>
       <w:r>
         <w:pict w14:anchorId="48DBAE81">
-          <v:rect id="_x0000_i1195" style="width:0;height:1.5pt" o:hralign="center" o:hrstd="t" o:hr="t" fillcolor="#a0a0a0" stroked="f"/>
+          <v:rect id="_x0000_i1045" style="width:0;height:1.5pt" o:hralign="center" o:hrstd="t" o:hr="t" fillcolor="#a0a0a0" stroked="f"/>
         </w:pict>
       </w:r>
     </w:p>
@@ -2121,7 +2121,7 @@
     <w:p>
       <w:r>
         <w:pict w14:anchorId="2EC2648E">
-          <v:rect id="_x0000_i1196" style="width:0;height:1.5pt" o:hralign="center" o:hrstd="t" o:hr="t" fillcolor="#a0a0a0" stroked="f"/>
+          <v:rect id="_x0000_i1046" style="width:0;height:1.5pt" o:hralign="center" o:hrstd="t" o:hr="t" fillcolor="#a0a0a0" stroked="f"/>
         </w:pict>
       </w:r>
     </w:p>
@@ -2242,7 +2242,7 @@
     <w:p>
       <w:r>
         <w:pict w14:anchorId="72985F51">
-          <v:rect id="_x0000_i1197" style="width:0;height:1.5pt" o:hralign="center" o:hrstd="t" o:hr="t" fillcolor="#a0a0a0" stroked="f"/>
+          <v:rect id="_x0000_i1047" style="width:0;height:1.5pt" o:hralign="center" o:hrstd="t" o:hr="t" fillcolor="#a0a0a0" stroked="f"/>
         </w:pict>
       </w:r>
     </w:p>
@@ -2336,7 +2336,7 @@
       <w:r>
         <w:lastRenderedPageBreak/>
         <w:pict w14:anchorId="5A8DAE6B">
-          <v:rect id="_x0000_i1198" style="width:0;height:1.5pt" o:hralign="center" o:hrstd="t" o:hr="t" fillcolor="#a0a0a0" stroked="f"/>
+          <v:rect id="_x0000_i1048" style="width:0;height:1.5pt" o:hralign="center" o:hrstd="t" o:hr="t" fillcolor="#a0a0a0" stroked="f"/>
         </w:pict>
       </w:r>
     </w:p>
@@ -2424,7 +2424,7 @@
     <w:p>
       <w:r>
         <w:pict w14:anchorId="086932CA">
-          <v:rect id="_x0000_i1199" style="width:0;height:1.5pt" o:hralign="center" o:hrstd="t" o:hr="t" fillcolor="#a0a0a0" stroked="f"/>
+          <v:rect id="_x0000_i1049" style="width:0;height:1.5pt" o:hralign="center" o:hrstd="t" o:hr="t" fillcolor="#a0a0a0" stroked="f"/>
         </w:pict>
       </w:r>
     </w:p>
@@ -2446,6 +2446,1049 @@
     <w:p>
       <w:r>
         <w:t>Developed a Real-Time Indian Stock Trading Simulator using MERN Stack with live NSE/BSE market integration, WebSocket-based real-time updates, portfolio analytics, financial news integration, candlestick chart visualization, and customizable dark/light mode for an interactive trading experience.</w:t>
+      </w:r>
+    </w:p>
+    <w:p/>
+    <w:p/>
+    <w:p/>
+    <w:p/>
+    <w:p/>
+    <w:p/>
+    <w:p/>
+    <w:p>
+      <w:r>
+        <w:t>I actually think your idea is better than having a traditional dashboard.</w:t>
+      </w:r>
+    </w:p>
+    <w:p>
+      <w:r>
+        <w:t>Professional trading platforms today are market-first, not dashboard-first.</w:t>
+      </w:r>
+    </w:p>
+    <w:p>
+      <w:r>
+        <w:t>Examples:</w:t>
+      </w:r>
+    </w:p>
+    <w:p>
+      <w:pPr>
+        <w:numPr>
+          <w:ilvl w:val="0"/>
+          <w:numId w:val="24"/>
+        </w:numPr>
+      </w:pPr>
+      <w:proofErr w:type="spellStart"/>
+      <w:r>
+        <w:t>Zerodha</w:t>
+      </w:r>
+      <w:proofErr w:type="spellEnd"/>
+      <w:r>
+        <w:t xml:space="preserve"> Kite opens directly into market/watchlist experience</w:t>
+      </w:r>
+    </w:p>
+    <w:p>
+      <w:pPr>
+        <w:numPr>
+          <w:ilvl w:val="0"/>
+          <w:numId w:val="24"/>
+        </w:numPr>
+      </w:pPr>
+      <w:proofErr w:type="spellStart"/>
+      <w:r>
+        <w:t>Upstox</w:t>
+      </w:r>
+      <w:proofErr w:type="spellEnd"/>
+      <w:r>
+        <w:t xml:space="preserve"> focuses immediately on markets and trading</w:t>
+      </w:r>
+    </w:p>
+    <w:p>
+      <w:pPr>
+        <w:numPr>
+          <w:ilvl w:val="0"/>
+          <w:numId w:val="24"/>
+        </w:numPr>
+      </w:pPr>
+      <w:proofErr w:type="spellStart"/>
+      <w:r>
+        <w:t>TradingView</w:t>
+      </w:r>
+      <w:proofErr w:type="spellEnd"/>
+      <w:r>
+        <w:t xml:space="preserve"> is chart/market </w:t>
+      </w:r>
+      <w:proofErr w:type="spellStart"/>
+      <w:r>
+        <w:t>centered</w:t>
+      </w:r>
+      <w:proofErr w:type="spellEnd"/>
+    </w:p>
+    <w:p>
+      <w:pPr>
+        <w:numPr>
+          <w:ilvl w:val="0"/>
+          <w:numId w:val="24"/>
+        </w:numPr>
+      </w:pPr>
+      <w:proofErr w:type="spellStart"/>
+      <w:r>
+        <w:t>Groww</w:t>
+      </w:r>
+      <w:proofErr w:type="spellEnd"/>
+      <w:r>
+        <w:t xml:space="preserve"> prioritizes discoverability and markets</w:t>
+      </w:r>
+    </w:p>
+    <w:p>
+      <w:proofErr w:type="gramStart"/>
+      <w:r>
+        <w:t>So</w:t>
+      </w:r>
+      <w:proofErr w:type="gramEnd"/>
+      <w:r>
+        <w:t xml:space="preserve"> your idea is correct.</w:t>
+      </w:r>
+    </w:p>
+    <w:p>
+      <w:pPr>
+        <w:rPr>
+          <w:b/>
+          <w:bCs/>
+        </w:rPr>
+      </w:pPr>
+      <w:r>
+        <w:rPr>
+          <w:b/>
+          <w:bCs/>
+        </w:rPr>
+        <w:t>My Recommendation</w:t>
+      </w:r>
+    </w:p>
+    <w:p>
+      <w:pPr>
+        <w:rPr>
+          <w:b/>
+          <w:bCs/>
+        </w:rPr>
+      </w:pPr>
+      <w:r>
+        <w:rPr>
+          <w:b/>
+          <w:bCs/>
+        </w:rPr>
+        <w:lastRenderedPageBreak/>
+        <w:t>Remove Dashboard as Main Entry</w:t>
+      </w:r>
+    </w:p>
+    <w:p>
+      <w:r>
+        <w:t>After login:</w:t>
+      </w:r>
+    </w:p>
+    <w:p>
+      <w:r>
+        <w:t>Login → Markets Page</w:t>
+      </w:r>
+    </w:p>
+    <w:p>
+      <w:r>
+        <w:t>This is the best UX for your platform.</w:t>
+      </w:r>
+    </w:p>
+    <w:p>
+      <w:r>
+        <w:pict w14:anchorId="37FC7B8B">
+          <v:rect id="_x0000_i1128" style="width:0;height:1.5pt" o:hralign="center" o:hrstd="t" o:hr="t" fillcolor="#a0a0a0" stroked="f"/>
+        </w:pict>
+      </w:r>
+    </w:p>
+    <w:p>
+      <w:pPr>
+        <w:rPr>
+          <w:b/>
+          <w:bCs/>
+        </w:rPr>
+      </w:pPr>
+      <w:r>
+        <w:rPr>
+          <w:b/>
+          <w:bCs/>
+        </w:rPr>
+        <w:t>New Professional Navigation Structure</w:t>
+      </w:r>
+    </w:p>
+    <w:p>
+      <w:r>
+        <w:t>Since you DON'T want sidebar, we’ll create a premium top navigation system.</w:t>
+      </w:r>
+    </w:p>
+    <w:p>
+      <w:pPr>
+        <w:rPr>
+          <w:b/>
+          <w:bCs/>
+        </w:rPr>
+      </w:pPr>
+      <w:r>
+        <w:rPr>
+          <w:b/>
+          <w:bCs/>
+        </w:rPr>
+        <w:t>Final Navbar Structure</w:t>
+      </w:r>
+    </w:p>
+    <w:p>
+      <w:r>
+        <w:t>Logo</w:t>
+      </w:r>
+    </w:p>
+    <w:p/>
+    <w:p>
+      <w:r>
+        <w:t>Markets</w:t>
+      </w:r>
+    </w:p>
+    <w:p>
+      <w:r>
+        <w:t>Watchlist</w:t>
+      </w:r>
+    </w:p>
+    <w:p>
+      <w:r>
+        <w:t>Trading</w:t>
+      </w:r>
+    </w:p>
+    <w:p>
+      <w:r>
+        <w:t>Portfolio</w:t>
+      </w:r>
+    </w:p>
+    <w:p>
+      <w:r>
+        <w:t>Orders</w:t>
+      </w:r>
+    </w:p>
+    <w:p>
+      <w:r>
+        <w:t>News</w:t>
+      </w:r>
+    </w:p>
+    <w:p/>
+    <w:p>
+      <w:r>
+        <w:t>Search Stocks...</w:t>
+      </w:r>
+    </w:p>
+    <w:p/>
+    <w:p>
+      <w:r>
+        <w:t>Profile Avatar</w:t>
+      </w:r>
+    </w:p>
+    <w:p>
+      <w:r>
+        <w:t>This is cleaner and more modern.</w:t>
+      </w:r>
+    </w:p>
+    <w:p>
+      <w:r>
+        <w:pict w14:anchorId="6C1C5A7C">
+          <v:rect id="_x0000_i1129" style="width:0;height:1.5pt" o:hralign="center" o:hrstd="t" o:hr="t" fillcolor="#a0a0a0" stroked="f"/>
+        </w:pict>
+      </w:r>
+    </w:p>
+    <w:p>
+      <w:pPr>
+        <w:rPr>
+          <w:b/>
+          <w:bCs/>
+        </w:rPr>
+      </w:pPr>
+      <w:r>
+        <w:rPr>
+          <w:b/>
+          <w:bCs/>
+        </w:rPr>
+        <w:t>Recommended Main Pages</w:t>
+      </w:r>
+    </w:p>
+    <w:p>
+      <w:pPr>
+        <w:rPr>
+          <w:b/>
+          <w:bCs/>
+        </w:rPr>
+      </w:pPr>
+      <w:r>
+        <w:rPr>
+          <w:b/>
+          <w:bCs/>
+        </w:rPr>
+        <w:t>1. Markets (Main Landing Page)</w:t>
+      </w:r>
+    </w:p>
+    <w:p>
+      <w:r>
+        <w:t>This becomes your homepage after login.</w:t>
+      </w:r>
+    </w:p>
+    <w:p>
+      <w:r>
+        <w:t>Purpose:</w:t>
+      </w:r>
+    </w:p>
+    <w:p>
+      <w:pPr>
+        <w:numPr>
+          <w:ilvl w:val="0"/>
+          <w:numId w:val="25"/>
+        </w:numPr>
+      </w:pPr>
+      <w:r>
+        <w:t>discover stocks</w:t>
+      </w:r>
+    </w:p>
+    <w:p>
+      <w:pPr>
+        <w:numPr>
+          <w:ilvl w:val="0"/>
+          <w:numId w:val="25"/>
+        </w:numPr>
+      </w:pPr>
+      <w:r>
+        <w:t>live NSE/BSE data</w:t>
+      </w:r>
+    </w:p>
+    <w:p>
+      <w:pPr>
+        <w:numPr>
+          <w:ilvl w:val="0"/>
+          <w:numId w:val="25"/>
+        </w:numPr>
+      </w:pPr>
+      <w:r>
+        <w:t>top movers</w:t>
+      </w:r>
+    </w:p>
+    <w:p>
+      <w:pPr>
+        <w:numPr>
+          <w:ilvl w:val="0"/>
+          <w:numId w:val="25"/>
+        </w:numPr>
+      </w:pPr>
+      <w:r>
+        <w:lastRenderedPageBreak/>
+        <w:t>sectors</w:t>
+      </w:r>
+    </w:p>
+    <w:p>
+      <w:pPr>
+        <w:numPr>
+          <w:ilvl w:val="0"/>
+          <w:numId w:val="25"/>
+        </w:numPr>
+      </w:pPr>
+      <w:r>
+        <w:t>indices</w:t>
+      </w:r>
+    </w:p>
+    <w:p>
+      <w:pPr>
+        <w:numPr>
+          <w:ilvl w:val="0"/>
+          <w:numId w:val="25"/>
+        </w:numPr>
+      </w:pPr>
+      <w:r>
+        <w:t>search</w:t>
+      </w:r>
+    </w:p>
+    <w:p>
+      <w:pPr>
+        <w:numPr>
+          <w:ilvl w:val="0"/>
+          <w:numId w:val="25"/>
+        </w:numPr>
+      </w:pPr>
+      <w:r>
+        <w:t>trending stocks</w:t>
+      </w:r>
+    </w:p>
+    <w:p>
+      <w:r>
+        <w:t>This is the HEART of the platform.</w:t>
+      </w:r>
+    </w:p>
+    <w:p>
+      <w:r>
+        <w:pict w14:anchorId="16C842D5">
+          <v:rect id="_x0000_i1130" style="width:0;height:1.5pt" o:hralign="center" o:hrstd="t" o:hr="t" fillcolor="#a0a0a0" stroked="f"/>
+        </w:pict>
+      </w:r>
+    </w:p>
+    <w:p>
+      <w:pPr>
+        <w:rPr>
+          <w:b/>
+          <w:bCs/>
+        </w:rPr>
+      </w:pPr>
+      <w:r>
+        <w:rPr>
+          <w:b/>
+          <w:bCs/>
+        </w:rPr>
+        <w:t>2. Watchlist</w:t>
+      </w:r>
+    </w:p>
+    <w:p>
+      <w:r>
+        <w:t>Dedicated watchlist management.</w:t>
+      </w:r>
+    </w:p>
+    <w:p>
+      <w:r>
+        <w:pict w14:anchorId="1BB89B8E">
+          <v:rect id="_x0000_i1131" style="width:0;height:1.5pt" o:hralign="center" o:hrstd="t" o:hr="t" fillcolor="#a0a0a0" stroked="f"/>
+        </w:pict>
+      </w:r>
+    </w:p>
+    <w:p>
+      <w:pPr>
+        <w:rPr>
+          <w:b/>
+          <w:bCs/>
+        </w:rPr>
+      </w:pPr>
+      <w:r>
+        <w:rPr>
+          <w:b/>
+          <w:bCs/>
+        </w:rPr>
+        <w:t>3. Trading</w:t>
+      </w:r>
+    </w:p>
+    <w:p>
+      <w:r>
+        <w:t>Professional trading terminal.</w:t>
+      </w:r>
+    </w:p>
+    <w:p>
+      <w:r>
+        <w:pict w14:anchorId="14345694">
+          <v:rect id="_x0000_i1132" style="width:0;height:1.5pt" o:hralign="center" o:hrstd="t" o:hr="t" fillcolor="#a0a0a0" stroked="f"/>
+        </w:pict>
+      </w:r>
+    </w:p>
+    <w:p>
+      <w:pPr>
+        <w:rPr>
+          <w:b/>
+          <w:bCs/>
+        </w:rPr>
+      </w:pPr>
+      <w:r>
+        <w:rPr>
+          <w:b/>
+          <w:bCs/>
+        </w:rPr>
+        <w:t>4. Portfolio</w:t>
+      </w:r>
+    </w:p>
+    <w:p>
+      <w:r>
+        <w:t>Analytics + holdings + P&amp;L.</w:t>
+      </w:r>
+    </w:p>
+    <w:p>
+      <w:r>
+        <w:pict w14:anchorId="36EA23E3">
+          <v:rect id="_x0000_i1133" style="width:0;height:1.5pt" o:hralign="center" o:hrstd="t" o:hr="t" fillcolor="#a0a0a0" stroked="f"/>
+        </w:pict>
+      </w:r>
+    </w:p>
+    <w:p>
+      <w:pPr>
+        <w:rPr>
+          <w:b/>
+          <w:bCs/>
+        </w:rPr>
+      </w:pPr>
+      <w:r>
+        <w:rPr>
+          <w:b/>
+          <w:bCs/>
+        </w:rPr>
+        <w:t>5. Orders</w:t>
+      </w:r>
+    </w:p>
+    <w:p>
+      <w:r>
+        <w:t>Order history and positions.</w:t>
+      </w:r>
+    </w:p>
+    <w:p>
+      <w:r>
+        <w:pict w14:anchorId="4F6F972D">
+          <v:rect id="_x0000_i1134" style="width:0;height:1.5pt" o:hralign="center" o:hrstd="t" o:hr="t" fillcolor="#a0a0a0" stroked="f"/>
+        </w:pict>
+      </w:r>
+    </w:p>
+    <w:p>
+      <w:pPr>
+        <w:rPr>
+          <w:b/>
+          <w:bCs/>
+        </w:rPr>
+      </w:pPr>
+      <w:r>
+        <w:rPr>
+          <w:b/>
+          <w:bCs/>
+        </w:rPr>
+        <w:t>6. News</w:t>
+      </w:r>
+    </w:p>
+    <w:p>
+      <w:r>
+        <w:t>Financial news + market events.</w:t>
+      </w:r>
+    </w:p>
+    <w:p>
+      <w:r>
+        <w:pict w14:anchorId="07077FC7">
+          <v:rect id="_x0000_i1135" style="width:0;height:1.5pt" o:hralign="center" o:hrstd="t" o:hr="t" fillcolor="#a0a0a0" stroked="f"/>
+        </w:pict>
+      </w:r>
+    </w:p>
+    <w:p>
+      <w:pPr>
+        <w:rPr>
+          <w:b/>
+          <w:bCs/>
+        </w:rPr>
+      </w:pPr>
+      <w:r>
+        <w:rPr>
+          <w:b/>
+          <w:bCs/>
+        </w:rPr>
+        <w:t>Important Architecture Decision</w:t>
+      </w:r>
+    </w:p>
+    <w:p>
+      <w:pPr>
+        <w:rPr>
+          <w:b/>
+          <w:bCs/>
+        </w:rPr>
+      </w:pPr>
+      <w:r>
+        <w:rPr>
+          <w:b/>
+          <w:bCs/>
+        </w:rPr>
+        <w:t>Dashboard becomes OPTIONAL</w:t>
+      </w:r>
+    </w:p>
+    <w:p>
+      <w:r>
+        <w:t>We can either:</w:t>
+      </w:r>
+    </w:p>
+    <w:p>
+      <w:pPr>
+        <w:numPr>
+          <w:ilvl w:val="0"/>
+          <w:numId w:val="26"/>
+        </w:numPr>
+      </w:pPr>
+      <w:r>
+        <w:t>completely remove dashboard</w:t>
+      </w:r>
+      <w:r>
+        <w:br/>
+        <w:t>OR</w:t>
+      </w:r>
+    </w:p>
+    <w:p>
+      <w:pPr>
+        <w:numPr>
+          <w:ilvl w:val="0"/>
+          <w:numId w:val="26"/>
+        </w:numPr>
+      </w:pPr>
+      <w:r>
+        <w:t>keep lightweight overview page accessible from profile menu</w:t>
+      </w:r>
+    </w:p>
+    <w:p>
+      <w:r>
+        <w:t>I recommend:</w:t>
+      </w:r>
+    </w:p>
+    <w:p>
+      <w:r>
+        <w:t>NO DASHBOARD PAGE</w:t>
+      </w:r>
+    </w:p>
+    <w:p>
+      <w:r>
+        <w:lastRenderedPageBreak/>
+        <w:t>Cleaner architecture.</w:t>
+      </w:r>
+    </w:p>
+    <w:p>
+      <w:r>
+        <w:pict w14:anchorId="45BDB462">
+          <v:rect id="_x0000_i1136" style="width:0;height:1.5pt" o:hralign="center" o:hrstd="t" o:hr="t" fillcolor="#a0a0a0" stroked="f"/>
+        </w:pict>
+      </w:r>
+    </w:p>
+    <w:p>
+      <w:pPr>
+        <w:rPr>
+          <w:b/>
+          <w:bCs/>
+        </w:rPr>
+      </w:pPr>
+      <w:r>
+        <w:rPr>
+          <w:b/>
+          <w:bCs/>
+        </w:rPr>
+        <w:t>New Flow</w:t>
+      </w:r>
+    </w:p>
+    <w:p>
+      <w:r>
+        <w:t>Login/Register</w:t>
+      </w:r>
+    </w:p>
+    <w:p>
+      <w:r>
+        <w:t xml:space="preserve">      ↓</w:t>
+      </w:r>
+    </w:p>
+    <w:p>
+      <w:r>
+        <w:t>Markets Page</w:t>
+      </w:r>
+    </w:p>
+    <w:p>
+      <w:r>
+        <w:t xml:space="preserve">      ↓</w:t>
+      </w:r>
+    </w:p>
+    <w:p>
+      <w:r>
+        <w:t>User navigates using top navbar</w:t>
+      </w:r>
+    </w:p>
+    <w:p>
+      <w:r>
+        <w:t>This is MUCH more professional.</w:t>
+      </w:r>
+    </w:p>
+    <w:p>
+      <w:r>
+        <w:pict w14:anchorId="19BDEB32">
+          <v:rect id="_x0000_i1137" style="width:0;height:1.5pt" o:hralign="center" o:hrstd="t" o:hr="t" fillcolor="#a0a0a0" stroked="f"/>
+        </w:pict>
+      </w:r>
+    </w:p>
+    <w:p>
+      <w:pPr>
+        <w:rPr>
+          <w:b/>
+          <w:bCs/>
+        </w:rPr>
+      </w:pPr>
+      <w:r>
+        <w:rPr>
+          <w:b/>
+          <w:bCs/>
+        </w:rPr>
+        <w:t>About Real-Time NSE/BSE Data</w:t>
+      </w:r>
+    </w:p>
+    <w:p>
+      <w:r>
+        <w:t>Your main task is the correct direction.</w:t>
+      </w:r>
+    </w:p>
+    <w:p>
+      <w:r>
+        <w:t>We should now build:</w:t>
+      </w:r>
+    </w:p>
+    <w:p>
+      <w:r>
+        <w:t>Markets Page</w:t>
+      </w:r>
+    </w:p>
+    <w:p>
+      <w:r>
+        <w:t xml:space="preserve">    ↓</w:t>
+      </w:r>
+    </w:p>
+    <w:p>
+      <w:r>
+        <w:t>Real-time stock engine</w:t>
+      </w:r>
+    </w:p>
+    <w:p>
+      <w:r>
+        <w:t xml:space="preserve">    ↓</w:t>
+      </w:r>
+    </w:p>
+    <w:p>
+      <w:r>
+        <w:t>Full NSE/BSE searchable universe</w:t>
+      </w:r>
+    </w:p>
+    <w:p>
+      <w:r>
+        <w:t>instead of wasting time polishing old dashboard sections.</w:t>
+      </w:r>
+    </w:p>
+    <w:p>
+      <w:r>
+        <w:pict w14:anchorId="25F49D9B">
+          <v:rect id="_x0000_i1138" style="width:0;height:1.5pt" o:hralign="center" o:hrstd="t" o:hr="t" fillcolor="#a0a0a0" stroked="f"/>
+        </w:pict>
+      </w:r>
+    </w:p>
+    <w:p>
+      <w:pPr>
+        <w:rPr>
+          <w:b/>
+          <w:bCs/>
+        </w:rPr>
+      </w:pPr>
+      <w:r>
+        <w:rPr>
+          <w:b/>
+          <w:bCs/>
+        </w:rPr>
+        <w:t>What We Start Today</w:t>
+      </w:r>
+    </w:p>
+    <w:p>
+      <w:pPr>
+        <w:rPr>
+          <w:b/>
+          <w:bCs/>
+        </w:rPr>
+      </w:pPr>
+      <w:r>
+        <w:rPr>
+          <w:b/>
+          <w:bCs/>
+        </w:rPr>
+        <w:t>Phase 1 — Frontend Architecture Cleanup</w:t>
+      </w:r>
+    </w:p>
+    <w:p>
+      <w:r>
+        <w:t>We will:</w:t>
+      </w:r>
+    </w:p>
+    <w:p>
+      <w:pPr>
+        <w:numPr>
+          <w:ilvl w:val="0"/>
+          <w:numId w:val="27"/>
+        </w:numPr>
+      </w:pPr>
+      <w:r>
+        <w:t>remove dashboard dependency</w:t>
+      </w:r>
+    </w:p>
+    <w:p>
+      <w:pPr>
+        <w:numPr>
+          <w:ilvl w:val="0"/>
+          <w:numId w:val="27"/>
+        </w:numPr>
+      </w:pPr>
+      <w:r>
+        <w:t>create clean routing</w:t>
+      </w:r>
+    </w:p>
+    <w:p>
+      <w:pPr>
+        <w:numPr>
+          <w:ilvl w:val="0"/>
+          <w:numId w:val="27"/>
+        </w:numPr>
+      </w:pPr>
+      <w:r>
+        <w:t>create premium top navbar</w:t>
+      </w:r>
+    </w:p>
+    <w:p>
+      <w:pPr>
+        <w:numPr>
+          <w:ilvl w:val="0"/>
+          <w:numId w:val="27"/>
+        </w:numPr>
+      </w:pPr>
+      <w:r>
+        <w:t>create markets landing page</w:t>
+      </w:r>
+    </w:p>
+    <w:p>
+      <w:pPr>
+        <w:numPr>
+          <w:ilvl w:val="0"/>
+          <w:numId w:val="27"/>
+        </w:numPr>
+      </w:pPr>
+      <w:r>
+        <w:t>split pages professionally</w:t>
+      </w:r>
+    </w:p>
+    <w:p>
+      <w:r>
+        <w:pict w14:anchorId="344EFEE1">
+          <v:rect id="_x0000_i1139" style="width:0;height:1.5pt" o:hralign="center" o:hrstd="t" o:hr="t" fillcolor="#a0a0a0" stroked="f"/>
+        </w:pict>
+      </w:r>
+    </w:p>
+    <w:p>
+      <w:pPr>
+        <w:rPr>
+          <w:b/>
+          <w:bCs/>
+        </w:rPr>
+      </w:pPr>
+      <w:r>
+        <w:rPr>
+          <w:b/>
+          <w:bCs/>
+        </w:rPr>
+        <w:lastRenderedPageBreak/>
+        <w:t>Phase 2 — Real Market Engine</w:t>
+      </w:r>
+    </w:p>
+    <w:p>
+      <w:r>
+        <w:t>We will:</w:t>
+      </w:r>
+    </w:p>
+    <w:p>
+      <w:pPr>
+        <w:numPr>
+          <w:ilvl w:val="0"/>
+          <w:numId w:val="28"/>
+        </w:numPr>
+      </w:pPr>
+      <w:r>
+        <w:t xml:space="preserve">integrate </w:t>
+      </w:r>
+      <w:proofErr w:type="spellStart"/>
+      <w:r>
+        <w:t>Upstox</w:t>
+      </w:r>
+      <w:proofErr w:type="spellEnd"/>
+      <w:r>
+        <w:t xml:space="preserve"> properly</w:t>
+      </w:r>
+    </w:p>
+    <w:p>
+      <w:pPr>
+        <w:numPr>
+          <w:ilvl w:val="0"/>
+          <w:numId w:val="28"/>
+        </w:numPr>
+      </w:pPr>
+      <w:r>
+        <w:t>load all NSE/BSE instruments</w:t>
+      </w:r>
+    </w:p>
+    <w:p>
+      <w:pPr>
+        <w:numPr>
+          <w:ilvl w:val="0"/>
+          <w:numId w:val="28"/>
+        </w:numPr>
+      </w:pPr>
+      <w:proofErr w:type="spellStart"/>
+      <w:r>
+        <w:t>websocket</w:t>
+      </w:r>
+      <w:proofErr w:type="spellEnd"/>
+      <w:r>
+        <w:t xml:space="preserve"> live updates</w:t>
+      </w:r>
+    </w:p>
+    <w:p>
+      <w:pPr>
+        <w:numPr>
+          <w:ilvl w:val="0"/>
+          <w:numId w:val="28"/>
+        </w:numPr>
+      </w:pPr>
+      <w:r>
+        <w:t>global market store</w:t>
+      </w:r>
+    </w:p>
+    <w:p>
+      <w:pPr>
+        <w:numPr>
+          <w:ilvl w:val="0"/>
+          <w:numId w:val="28"/>
+        </w:numPr>
+      </w:pPr>
+      <w:r>
+        <w:t>real-time ticker</w:t>
+      </w:r>
+    </w:p>
+    <w:p>
+      <w:pPr>
+        <w:numPr>
+          <w:ilvl w:val="0"/>
+          <w:numId w:val="28"/>
+        </w:numPr>
+      </w:pPr>
+      <w:r>
+        <w:t>advanced search</w:t>
+      </w:r>
+    </w:p>
+    <w:p>
+      <w:r>
+        <w:pict w14:anchorId="5594C0B9">
+          <v:rect id="_x0000_i1140" style="width:0;height:1.5pt" o:hralign="center" o:hrstd="t" o:hr="t" fillcolor="#a0a0a0" stroked="f"/>
+        </w:pict>
+      </w:r>
+    </w:p>
+    <w:p>
+      <w:pPr>
+        <w:rPr>
+          <w:b/>
+          <w:bCs/>
+        </w:rPr>
+      </w:pPr>
+      <w:r>
+        <w:rPr>
+          <w:b/>
+          <w:bCs/>
+        </w:rPr>
+        <w:t>Final Decision I Recommend</w:t>
+      </w:r>
+    </w:p>
+    <w:p>
+      <w:r>
+        <w:rPr>
+          <w:rFonts w:ascii="Segoe UI Emoji" w:hAnsi="Segoe UI Emoji" w:cs="Segoe UI Emoji"/>
+        </w:rPr>
+        <w:t>✅</w:t>
+      </w:r>
+      <w:r>
+        <w:t xml:space="preserve"> No sidebar</w:t>
+      </w:r>
+      <w:r>
+        <w:br/>
+      </w:r>
+      <w:r>
+        <w:rPr>
+          <w:rFonts w:ascii="Segoe UI Emoji" w:hAnsi="Segoe UI Emoji" w:cs="Segoe UI Emoji"/>
+        </w:rPr>
+        <w:t>✅</w:t>
+      </w:r>
+      <w:r>
+        <w:t xml:space="preserve"> No heavy dashboard</w:t>
+      </w:r>
+      <w:r>
+        <w:br/>
+      </w:r>
+      <w:r>
+        <w:rPr>
+          <w:rFonts w:ascii="Segoe UI Emoji" w:hAnsi="Segoe UI Emoji" w:cs="Segoe UI Emoji"/>
+        </w:rPr>
+        <w:t>✅</w:t>
+      </w:r>
+      <w:r>
+        <w:t xml:space="preserve"> Markets page as home after login</w:t>
+      </w:r>
+      <w:r>
+        <w:br/>
+      </w:r>
+      <w:r>
+        <w:rPr>
+          <w:rFonts w:ascii="Segoe UI Emoji" w:hAnsi="Segoe UI Emoji" w:cs="Segoe UI Emoji"/>
+        </w:rPr>
+        <w:t>✅</w:t>
+      </w:r>
+      <w:r>
+        <w:t xml:space="preserve"> Professional top navbar only</w:t>
+      </w:r>
+      <w:r>
+        <w:br/>
+      </w:r>
+      <w:r>
+        <w:rPr>
+          <w:rFonts w:ascii="Segoe UI Emoji" w:hAnsi="Segoe UI Emoji" w:cs="Segoe UI Emoji"/>
+        </w:rPr>
+        <w:t>✅</w:t>
+      </w:r>
+      <w:r>
+        <w:t xml:space="preserve"> Dedicated pages for every job</w:t>
+      </w:r>
+      <w:r>
+        <w:br/>
+      </w:r>
+      <w:r>
+        <w:rPr>
+          <w:rFonts w:ascii="Segoe UI Emoji" w:hAnsi="Segoe UI Emoji" w:cs="Segoe UI Emoji"/>
+        </w:rPr>
+        <w:t>✅</w:t>
+      </w:r>
+      <w:r>
+        <w:t xml:space="preserve"> Real-time NSE/BSE architecture first</w:t>
+      </w:r>
+      <w:r>
+        <w:br/>
+      </w:r>
+      <w:r>
+        <w:rPr>
+          <w:rFonts w:ascii="Segoe UI Emoji" w:hAnsi="Segoe UI Emoji" w:cs="Segoe UI Emoji"/>
+        </w:rPr>
+        <w:t>✅</w:t>
+      </w:r>
+      <w:r>
+        <w:t xml:space="preserve"> </w:t>
+      </w:r>
+      <w:proofErr w:type="spellStart"/>
+      <w:r>
+        <w:t>Upstox</w:t>
+      </w:r>
+      <w:proofErr w:type="spellEnd"/>
+      <w:r>
+        <w:t>/</w:t>
+      </w:r>
+      <w:proofErr w:type="spellStart"/>
+      <w:r>
+        <w:t>Zerodha</w:t>
+      </w:r>
+      <w:proofErr w:type="spellEnd"/>
+      <w:r>
+        <w:t xml:space="preserve"> style experience</w:t>
+      </w:r>
+    </w:p>
+    <w:p>
+      <w:r>
+        <w:t xml:space="preserve">This is the correct direction for </w:t>
+      </w:r>
+      <w:proofErr w:type="spellStart"/>
+      <w:r>
+        <w:t>TradeXpert</w:t>
+      </w:r>
+      <w:proofErr w:type="spellEnd"/>
+      <w:r>
+        <w:t xml:space="preserve"> now.</w:t>
       </w:r>
     </w:p>
     <w:p/>
@@ -2760,6 +3803,155 @@
     </w:lvl>
   </w:abstractNum>
   <w:abstractNum w:abstractNumId="2" w15:restartNumberingAfterBreak="0">
+    <w:nsid w:val="04834D5D"/>
+    <w:multiLevelType w:val="multilevel"/>
+    <w:tmpl w:val="552CE8AE"/>
+    <w:lvl w:ilvl="0">
+      <w:start w:val="1"/>
+      <w:numFmt w:val="bullet"/>
+      <w:lvlText w:val=""/>
+      <w:lvlJc w:val="left"/>
+      <w:pPr>
+        <w:tabs>
+          <w:tab w:val="num" w:pos="720"/>
+        </w:tabs>
+        <w:ind w:left="720" w:hanging="360"/>
+      </w:pPr>
+      <w:rPr>
+        <w:rFonts w:ascii="Symbol" w:hAnsi="Symbol" w:hint="default"/>
+        <w:sz w:val="20"/>
+      </w:rPr>
+    </w:lvl>
+    <w:lvl w:ilvl="1" w:tentative="1">
+      <w:start w:val="1"/>
+      <w:numFmt w:val="bullet"/>
+      <w:lvlText w:val="o"/>
+      <w:lvlJc w:val="left"/>
+      <w:pPr>
+        <w:tabs>
+          <w:tab w:val="num" w:pos="1440"/>
+        </w:tabs>
+        <w:ind w:left="1440" w:hanging="360"/>
+      </w:pPr>
+      <w:rPr>
+        <w:rFonts w:ascii="Courier New" w:hAnsi="Courier New" w:hint="default"/>
+        <w:sz w:val="20"/>
+      </w:rPr>
+    </w:lvl>
+    <w:lvl w:ilvl="2" w:tentative="1">
+      <w:start w:val="1"/>
+      <w:numFmt w:val="bullet"/>
+      <w:lvlText w:val=""/>
+      <w:lvlJc w:val="left"/>
+      <w:pPr>
+        <w:tabs>
+          <w:tab w:val="num" w:pos="2160"/>
+        </w:tabs>
+        <w:ind w:left="2160" w:hanging="360"/>
+      </w:pPr>
+      <w:rPr>
+        <w:rFonts w:ascii="Wingdings" w:hAnsi="Wingdings" w:hint="default"/>
+        <w:sz w:val="20"/>
+      </w:rPr>
+    </w:lvl>
+    <w:lvl w:ilvl="3" w:tentative="1">
+      <w:start w:val="1"/>
+      <w:numFmt w:val="bullet"/>
+      <w:lvlText w:val=""/>
+      <w:lvlJc w:val="left"/>
+      <w:pPr>
+        <w:tabs>
+          <w:tab w:val="num" w:pos="2880"/>
+        </w:tabs>
+        <w:ind w:left="2880" w:hanging="360"/>
+      </w:pPr>
+      <w:rPr>
+        <w:rFonts w:ascii="Wingdings" w:hAnsi="Wingdings" w:hint="default"/>
+        <w:sz w:val="20"/>
+      </w:rPr>
+    </w:lvl>
+    <w:lvl w:ilvl="4" w:tentative="1">
+      <w:start w:val="1"/>
+      <w:numFmt w:val="bullet"/>
+      <w:lvlText w:val=""/>
+      <w:lvlJc w:val="left"/>
+      <w:pPr>
+        <w:tabs>
+          <w:tab w:val="num" w:pos="3600"/>
+        </w:tabs>
+        <w:ind w:left="3600" w:hanging="360"/>
+      </w:pPr>
+      <w:rPr>
+        <w:rFonts w:ascii="Wingdings" w:hAnsi="Wingdings" w:hint="default"/>
+        <w:sz w:val="20"/>
+      </w:rPr>
+    </w:lvl>
+    <w:lvl w:ilvl="5" w:tentative="1">
+      <w:start w:val="1"/>
+      <w:numFmt w:val="bullet"/>
+      <w:lvlText w:val=""/>
+      <w:lvlJc w:val="left"/>
+      <w:pPr>
+        <w:tabs>
+          <w:tab w:val="num" w:pos="4320"/>
+        </w:tabs>
+        <w:ind w:left="4320" w:hanging="360"/>
+      </w:pPr>
+      <w:rPr>
+        <w:rFonts w:ascii="Wingdings" w:hAnsi="Wingdings" w:hint="default"/>
+        <w:sz w:val="20"/>
+      </w:rPr>
+    </w:lvl>
+    <w:lvl w:ilvl="6" w:tentative="1">
+      <w:start w:val="1"/>
+      <w:numFmt w:val="bullet"/>
+      <w:lvlText w:val=""/>
+      <w:lvlJc w:val="left"/>
+      <w:pPr>
+        <w:tabs>
+          <w:tab w:val="num" w:pos="5040"/>
+        </w:tabs>
+        <w:ind w:left="5040" w:hanging="360"/>
+      </w:pPr>
+      <w:rPr>
+        <w:rFonts w:ascii="Wingdings" w:hAnsi="Wingdings" w:hint="default"/>
+        <w:sz w:val="20"/>
+      </w:rPr>
+    </w:lvl>
+    <w:lvl w:ilvl="7" w:tentative="1">
+      <w:start w:val="1"/>
+      <w:numFmt w:val="bullet"/>
+      <w:lvlText w:val=""/>
+      <w:lvlJc w:val="left"/>
+      <w:pPr>
+        <w:tabs>
+          <w:tab w:val="num" w:pos="5760"/>
+        </w:tabs>
+        <w:ind w:left="5760" w:hanging="360"/>
+      </w:pPr>
+      <w:rPr>
+        <w:rFonts w:ascii="Wingdings" w:hAnsi="Wingdings" w:hint="default"/>
+        <w:sz w:val="20"/>
+      </w:rPr>
+    </w:lvl>
+    <w:lvl w:ilvl="8" w:tentative="1">
+      <w:start w:val="1"/>
+      <w:numFmt w:val="bullet"/>
+      <w:lvlText w:val=""/>
+      <w:lvlJc w:val="left"/>
+      <w:pPr>
+        <w:tabs>
+          <w:tab w:val="num" w:pos="6480"/>
+        </w:tabs>
+        <w:ind w:left="6480" w:hanging="360"/>
+      </w:pPr>
+      <w:rPr>
+        <w:rFonts w:ascii="Wingdings" w:hAnsi="Wingdings" w:hint="default"/>
+        <w:sz w:val="20"/>
+      </w:rPr>
+    </w:lvl>
+  </w:abstractNum>
+  <w:abstractNum w:abstractNumId="3" w15:restartNumberingAfterBreak="0">
     <w:nsid w:val="07F14EFE"/>
     <w:multiLevelType w:val="multilevel"/>
     <w:tmpl w:val="4CEEC4A2"/>
@@ -2908,7 +4100,7 @@
       </w:rPr>
     </w:lvl>
   </w:abstractNum>
-  <w:abstractNum w:abstractNumId="3" w15:restartNumberingAfterBreak="0">
+  <w:abstractNum w:abstractNumId="4" w15:restartNumberingAfterBreak="0">
     <w:nsid w:val="0C0E3516"/>
     <w:multiLevelType w:val="multilevel"/>
     <w:tmpl w:val="8A0A2406"/>
@@ -3057,7 +4249,7 @@
       </w:rPr>
     </w:lvl>
   </w:abstractNum>
-  <w:abstractNum w:abstractNumId="4" w15:restartNumberingAfterBreak="0">
+  <w:abstractNum w:abstractNumId="5" w15:restartNumberingAfterBreak="0">
     <w:nsid w:val="11FB714B"/>
     <w:multiLevelType w:val="multilevel"/>
     <w:tmpl w:val="25B4E6BC"/>
@@ -3206,7 +4398,7 @@
       </w:rPr>
     </w:lvl>
   </w:abstractNum>
-  <w:abstractNum w:abstractNumId="5" w15:restartNumberingAfterBreak="0">
+  <w:abstractNum w:abstractNumId="6" w15:restartNumberingAfterBreak="0">
     <w:nsid w:val="1B05385C"/>
     <w:multiLevelType w:val="multilevel"/>
     <w:tmpl w:val="E6C23C38"/>
@@ -3355,7 +4547,305 @@
       </w:rPr>
     </w:lvl>
   </w:abstractNum>
-  <w:abstractNum w:abstractNumId="6" w15:restartNumberingAfterBreak="0">
+  <w:abstractNum w:abstractNumId="7" w15:restartNumberingAfterBreak="0">
+    <w:nsid w:val="1C1F020C"/>
+    <w:multiLevelType w:val="multilevel"/>
+    <w:tmpl w:val="771A8FFC"/>
+    <w:lvl w:ilvl="0">
+      <w:start w:val="1"/>
+      <w:numFmt w:val="bullet"/>
+      <w:lvlText w:val=""/>
+      <w:lvlJc w:val="left"/>
+      <w:pPr>
+        <w:tabs>
+          <w:tab w:val="num" w:pos="720"/>
+        </w:tabs>
+        <w:ind w:left="720" w:hanging="360"/>
+      </w:pPr>
+      <w:rPr>
+        <w:rFonts w:ascii="Symbol" w:hAnsi="Symbol" w:hint="default"/>
+        <w:sz w:val="20"/>
+      </w:rPr>
+    </w:lvl>
+    <w:lvl w:ilvl="1" w:tentative="1">
+      <w:start w:val="1"/>
+      <w:numFmt w:val="bullet"/>
+      <w:lvlText w:val="o"/>
+      <w:lvlJc w:val="left"/>
+      <w:pPr>
+        <w:tabs>
+          <w:tab w:val="num" w:pos="1440"/>
+        </w:tabs>
+        <w:ind w:left="1440" w:hanging="360"/>
+      </w:pPr>
+      <w:rPr>
+        <w:rFonts w:ascii="Courier New" w:hAnsi="Courier New" w:hint="default"/>
+        <w:sz w:val="20"/>
+      </w:rPr>
+    </w:lvl>
+    <w:lvl w:ilvl="2" w:tentative="1">
+      <w:start w:val="1"/>
+      <w:numFmt w:val="bullet"/>
+      <w:lvlText w:val=""/>
+      <w:lvlJc w:val="left"/>
+      <w:pPr>
+        <w:tabs>
+          <w:tab w:val="num" w:pos="2160"/>
+        </w:tabs>
+        <w:ind w:left="2160" w:hanging="360"/>
+      </w:pPr>
+      <w:rPr>
+        <w:rFonts w:ascii="Wingdings" w:hAnsi="Wingdings" w:hint="default"/>
+        <w:sz w:val="20"/>
+      </w:rPr>
+    </w:lvl>
+    <w:lvl w:ilvl="3" w:tentative="1">
+      <w:start w:val="1"/>
+      <w:numFmt w:val="bullet"/>
+      <w:lvlText w:val=""/>
+      <w:lvlJc w:val="left"/>
+      <w:pPr>
+        <w:tabs>
+          <w:tab w:val="num" w:pos="2880"/>
+        </w:tabs>
+        <w:ind w:left="2880" w:hanging="360"/>
+      </w:pPr>
+      <w:rPr>
+        <w:rFonts w:ascii="Wingdings" w:hAnsi="Wingdings" w:hint="default"/>
+        <w:sz w:val="20"/>
+      </w:rPr>
+    </w:lvl>
+    <w:lvl w:ilvl="4" w:tentative="1">
+      <w:start w:val="1"/>
+      <w:numFmt w:val="bullet"/>
+      <w:lvlText w:val=""/>
+      <w:lvlJc w:val="left"/>
+      <w:pPr>
+        <w:tabs>
+          <w:tab w:val="num" w:pos="3600"/>
+        </w:tabs>
+        <w:ind w:left="3600" w:hanging="360"/>
+      </w:pPr>
+      <w:rPr>
+        <w:rFonts w:ascii="Wingdings" w:hAnsi="Wingdings" w:hint="default"/>
+        <w:sz w:val="20"/>
+      </w:rPr>
+    </w:lvl>
+    <w:lvl w:ilvl="5" w:tentative="1">
+      <w:start w:val="1"/>
+      <w:numFmt w:val="bullet"/>
+      <w:lvlText w:val=""/>
+      <w:lvlJc w:val="left"/>
+      <w:pPr>
+        <w:tabs>
+          <w:tab w:val="num" w:pos="4320"/>
+        </w:tabs>
+        <w:ind w:left="4320" w:hanging="360"/>
+      </w:pPr>
+      <w:rPr>
+        <w:rFonts w:ascii="Wingdings" w:hAnsi="Wingdings" w:hint="default"/>
+        <w:sz w:val="20"/>
+      </w:rPr>
+    </w:lvl>
+    <w:lvl w:ilvl="6" w:tentative="1">
+      <w:start w:val="1"/>
+      <w:numFmt w:val="bullet"/>
+      <w:lvlText w:val=""/>
+      <w:lvlJc w:val="left"/>
+      <w:pPr>
+        <w:tabs>
+          <w:tab w:val="num" w:pos="5040"/>
+        </w:tabs>
+        <w:ind w:left="5040" w:hanging="360"/>
+      </w:pPr>
+      <w:rPr>
+        <w:rFonts w:ascii="Wingdings" w:hAnsi="Wingdings" w:hint="default"/>
+        <w:sz w:val="20"/>
+      </w:rPr>
+    </w:lvl>
+    <w:lvl w:ilvl="7" w:tentative="1">
+      <w:start w:val="1"/>
+      <w:numFmt w:val="bullet"/>
+      <w:lvlText w:val=""/>
+      <w:lvlJc w:val="left"/>
+      <w:pPr>
+        <w:tabs>
+          <w:tab w:val="num" w:pos="5760"/>
+        </w:tabs>
+        <w:ind w:left="5760" w:hanging="360"/>
+      </w:pPr>
+      <w:rPr>
+        <w:rFonts w:ascii="Wingdings" w:hAnsi="Wingdings" w:hint="default"/>
+        <w:sz w:val="20"/>
+      </w:rPr>
+    </w:lvl>
+    <w:lvl w:ilvl="8" w:tentative="1">
+      <w:start w:val="1"/>
+      <w:numFmt w:val="bullet"/>
+      <w:lvlText w:val=""/>
+      <w:lvlJc w:val="left"/>
+      <w:pPr>
+        <w:tabs>
+          <w:tab w:val="num" w:pos="6480"/>
+        </w:tabs>
+        <w:ind w:left="6480" w:hanging="360"/>
+      </w:pPr>
+      <w:rPr>
+        <w:rFonts w:ascii="Wingdings" w:hAnsi="Wingdings" w:hint="default"/>
+        <w:sz w:val="20"/>
+      </w:rPr>
+    </w:lvl>
+  </w:abstractNum>
+  <w:abstractNum w:abstractNumId="8" w15:restartNumberingAfterBreak="0">
+    <w:nsid w:val="2949222A"/>
+    <w:multiLevelType w:val="multilevel"/>
+    <w:tmpl w:val="A8041052"/>
+    <w:lvl w:ilvl="0">
+      <w:start w:val="1"/>
+      <w:numFmt w:val="bullet"/>
+      <w:lvlText w:val=""/>
+      <w:lvlJc w:val="left"/>
+      <w:pPr>
+        <w:tabs>
+          <w:tab w:val="num" w:pos="720"/>
+        </w:tabs>
+        <w:ind w:left="720" w:hanging="360"/>
+      </w:pPr>
+      <w:rPr>
+        <w:rFonts w:ascii="Symbol" w:hAnsi="Symbol" w:hint="default"/>
+        <w:sz w:val="20"/>
+      </w:rPr>
+    </w:lvl>
+    <w:lvl w:ilvl="1" w:tentative="1">
+      <w:start w:val="1"/>
+      <w:numFmt w:val="bullet"/>
+      <w:lvlText w:val="o"/>
+      <w:lvlJc w:val="left"/>
+      <w:pPr>
+        <w:tabs>
+          <w:tab w:val="num" w:pos="1440"/>
+        </w:tabs>
+        <w:ind w:left="1440" w:hanging="360"/>
+      </w:pPr>
+      <w:rPr>
+        <w:rFonts w:ascii="Courier New" w:hAnsi="Courier New" w:hint="default"/>
+        <w:sz w:val="20"/>
+      </w:rPr>
+    </w:lvl>
+    <w:lvl w:ilvl="2" w:tentative="1">
+      <w:start w:val="1"/>
+      <w:numFmt w:val="bullet"/>
+      <w:lvlText w:val=""/>
+      <w:lvlJc w:val="left"/>
+      <w:pPr>
+        <w:tabs>
+          <w:tab w:val="num" w:pos="2160"/>
+        </w:tabs>
+        <w:ind w:left="2160" w:hanging="360"/>
+      </w:pPr>
+      <w:rPr>
+        <w:rFonts w:ascii="Wingdings" w:hAnsi="Wingdings" w:hint="default"/>
+        <w:sz w:val="20"/>
+      </w:rPr>
+    </w:lvl>
+    <w:lvl w:ilvl="3" w:tentative="1">
+      <w:start w:val="1"/>
+      <w:numFmt w:val="bullet"/>
+      <w:lvlText w:val=""/>
+      <w:lvlJc w:val="left"/>
+      <w:pPr>
+        <w:tabs>
+          <w:tab w:val="num" w:pos="2880"/>
+        </w:tabs>
+        <w:ind w:left="2880" w:hanging="360"/>
+      </w:pPr>
+      <w:rPr>
+        <w:rFonts w:ascii="Wingdings" w:hAnsi="Wingdings" w:hint="default"/>
+        <w:sz w:val="20"/>
+      </w:rPr>
+    </w:lvl>
+    <w:lvl w:ilvl="4" w:tentative="1">
+      <w:start w:val="1"/>
+      <w:numFmt w:val="bullet"/>
+      <w:lvlText w:val=""/>
+      <w:lvlJc w:val="left"/>
+      <w:pPr>
+        <w:tabs>
+          <w:tab w:val="num" w:pos="3600"/>
+        </w:tabs>
+        <w:ind w:left="3600" w:hanging="360"/>
+      </w:pPr>
+      <w:rPr>
+        <w:rFonts w:ascii="Wingdings" w:hAnsi="Wingdings" w:hint="default"/>
+        <w:sz w:val="20"/>
+      </w:rPr>
+    </w:lvl>
+    <w:lvl w:ilvl="5" w:tentative="1">
+      <w:start w:val="1"/>
+      <w:numFmt w:val="bullet"/>
+      <w:lvlText w:val=""/>
+      <w:lvlJc w:val="left"/>
+      <w:pPr>
+        <w:tabs>
+          <w:tab w:val="num" w:pos="4320"/>
+        </w:tabs>
+        <w:ind w:left="4320" w:hanging="360"/>
+      </w:pPr>
+      <w:rPr>
+        <w:rFonts w:ascii="Wingdings" w:hAnsi="Wingdings" w:hint="default"/>
+        <w:sz w:val="20"/>
+      </w:rPr>
+    </w:lvl>
+    <w:lvl w:ilvl="6" w:tentative="1">
+      <w:start w:val="1"/>
+      <w:numFmt w:val="bullet"/>
+      <w:lvlText w:val=""/>
+      <w:lvlJc w:val="left"/>
+      <w:pPr>
+        <w:tabs>
+          <w:tab w:val="num" w:pos="5040"/>
+        </w:tabs>
+        <w:ind w:left="5040" w:hanging="360"/>
+      </w:pPr>
+      <w:rPr>
+        <w:rFonts w:ascii="Wingdings" w:hAnsi="Wingdings" w:hint="default"/>
+        <w:sz w:val="20"/>
+      </w:rPr>
+    </w:lvl>
+    <w:lvl w:ilvl="7" w:tentative="1">
+      <w:start w:val="1"/>
+      <w:numFmt w:val="bullet"/>
+      <w:lvlText w:val=""/>
+      <w:lvlJc w:val="left"/>
+      <w:pPr>
+        <w:tabs>
+          <w:tab w:val="num" w:pos="5760"/>
+        </w:tabs>
+        <w:ind w:left="5760" w:hanging="360"/>
+      </w:pPr>
+      <w:rPr>
+        <w:rFonts w:ascii="Wingdings" w:hAnsi="Wingdings" w:hint="default"/>
+        <w:sz w:val="20"/>
+      </w:rPr>
+    </w:lvl>
+    <w:lvl w:ilvl="8" w:tentative="1">
+      <w:start w:val="1"/>
+      <w:numFmt w:val="bullet"/>
+      <w:lvlText w:val=""/>
+      <w:lvlJc w:val="left"/>
+      <w:pPr>
+        <w:tabs>
+          <w:tab w:val="num" w:pos="6480"/>
+        </w:tabs>
+        <w:ind w:left="6480" w:hanging="360"/>
+      </w:pPr>
+      <w:rPr>
+        <w:rFonts w:ascii="Wingdings" w:hAnsi="Wingdings" w:hint="default"/>
+        <w:sz w:val="20"/>
+      </w:rPr>
+    </w:lvl>
+  </w:abstractNum>
+  <w:abstractNum w:abstractNumId="9" w15:restartNumberingAfterBreak="0">
     <w:nsid w:val="29A960A6"/>
     <w:multiLevelType w:val="multilevel"/>
     <w:tmpl w:val="F3DCF188"/>
@@ -3504,7 +4994,7 @@
       </w:rPr>
     </w:lvl>
   </w:abstractNum>
-  <w:abstractNum w:abstractNumId="7" w15:restartNumberingAfterBreak="0">
+  <w:abstractNum w:abstractNumId="10" w15:restartNumberingAfterBreak="0">
     <w:nsid w:val="30DA5F44"/>
     <w:multiLevelType w:val="multilevel"/>
     <w:tmpl w:val="214A8156"/>
@@ -3653,7 +5143,7 @@
       </w:rPr>
     </w:lvl>
   </w:abstractNum>
-  <w:abstractNum w:abstractNumId="8" w15:restartNumberingAfterBreak="0">
+  <w:abstractNum w:abstractNumId="11" w15:restartNumberingAfterBreak="0">
     <w:nsid w:val="34EF7573"/>
     <w:multiLevelType w:val="multilevel"/>
     <w:tmpl w:val="35E6148E"/>
@@ -3802,7 +5292,7 @@
       </w:rPr>
     </w:lvl>
   </w:abstractNum>
-  <w:abstractNum w:abstractNumId="9" w15:restartNumberingAfterBreak="0">
+  <w:abstractNum w:abstractNumId="12" w15:restartNumberingAfterBreak="0">
     <w:nsid w:val="36EA64A3"/>
     <w:multiLevelType w:val="multilevel"/>
     <w:tmpl w:val="3F561212"/>
@@ -3951,7 +5441,7 @@
       </w:rPr>
     </w:lvl>
   </w:abstractNum>
-  <w:abstractNum w:abstractNumId="10" w15:restartNumberingAfterBreak="0">
+  <w:abstractNum w:abstractNumId="13" w15:restartNumberingAfterBreak="0">
     <w:nsid w:val="3E6B560A"/>
     <w:multiLevelType w:val="multilevel"/>
     <w:tmpl w:val="2528E824"/>
@@ -4100,7 +5590,7 @@
       </w:rPr>
     </w:lvl>
   </w:abstractNum>
-  <w:abstractNum w:abstractNumId="11" w15:restartNumberingAfterBreak="0">
+  <w:abstractNum w:abstractNumId="14" w15:restartNumberingAfterBreak="0">
     <w:nsid w:val="47E01CD9"/>
     <w:multiLevelType w:val="multilevel"/>
     <w:tmpl w:val="CD6AE796"/>
@@ -4249,7 +5739,7 @@
       </w:rPr>
     </w:lvl>
   </w:abstractNum>
-  <w:abstractNum w:abstractNumId="12" w15:restartNumberingAfterBreak="0">
+  <w:abstractNum w:abstractNumId="15" w15:restartNumberingAfterBreak="0">
     <w:nsid w:val="4FAB0926"/>
     <w:multiLevelType w:val="multilevel"/>
     <w:tmpl w:val="44EA1934"/>
@@ -4398,7 +5888,7 @@
       </w:rPr>
     </w:lvl>
   </w:abstractNum>
-  <w:abstractNum w:abstractNumId="13" w15:restartNumberingAfterBreak="0">
+  <w:abstractNum w:abstractNumId="16" w15:restartNumberingAfterBreak="0">
     <w:nsid w:val="51655162"/>
     <w:multiLevelType w:val="multilevel"/>
     <w:tmpl w:val="D944C68A"/>
@@ -4547,7 +6037,7 @@
       </w:rPr>
     </w:lvl>
   </w:abstractNum>
-  <w:abstractNum w:abstractNumId="14" w15:restartNumberingAfterBreak="0">
+  <w:abstractNum w:abstractNumId="17" w15:restartNumberingAfterBreak="0">
     <w:nsid w:val="536D370E"/>
     <w:multiLevelType w:val="multilevel"/>
     <w:tmpl w:val="B4BE798C"/>
@@ -4696,7 +6186,7 @@
       </w:rPr>
     </w:lvl>
   </w:abstractNum>
-  <w:abstractNum w:abstractNumId="15" w15:restartNumberingAfterBreak="0">
+  <w:abstractNum w:abstractNumId="18" w15:restartNumberingAfterBreak="0">
     <w:nsid w:val="55A7401D"/>
     <w:multiLevelType w:val="multilevel"/>
     <w:tmpl w:val="924E3754"/>
@@ -4845,7 +6335,7 @@
       </w:rPr>
     </w:lvl>
   </w:abstractNum>
-  <w:abstractNum w:abstractNumId="16" w15:restartNumberingAfterBreak="0">
+  <w:abstractNum w:abstractNumId="19" w15:restartNumberingAfterBreak="0">
     <w:nsid w:val="572D134E"/>
     <w:multiLevelType w:val="multilevel"/>
     <w:tmpl w:val="9B94F09E"/>
@@ -4994,7 +6484,7 @@
       </w:rPr>
     </w:lvl>
   </w:abstractNum>
-  <w:abstractNum w:abstractNumId="17" w15:restartNumberingAfterBreak="0">
+  <w:abstractNum w:abstractNumId="20" w15:restartNumberingAfterBreak="0">
     <w:nsid w:val="57EE1550"/>
     <w:multiLevelType w:val="multilevel"/>
     <w:tmpl w:val="871A55B0"/>
@@ -5143,7 +6633,7 @@
       </w:rPr>
     </w:lvl>
   </w:abstractNum>
-  <w:abstractNum w:abstractNumId="18" w15:restartNumberingAfterBreak="0">
+  <w:abstractNum w:abstractNumId="21" w15:restartNumberingAfterBreak="0">
     <w:nsid w:val="59AF60A2"/>
     <w:multiLevelType w:val="multilevel"/>
     <w:tmpl w:val="E0AA90F4"/>
@@ -5292,7 +6782,7 @@
       </w:rPr>
     </w:lvl>
   </w:abstractNum>
-  <w:abstractNum w:abstractNumId="19" w15:restartNumberingAfterBreak="0">
+  <w:abstractNum w:abstractNumId="22" w15:restartNumberingAfterBreak="0">
     <w:nsid w:val="621C2608"/>
     <w:multiLevelType w:val="multilevel"/>
     <w:tmpl w:val="6B14658A"/>
@@ -5441,7 +6931,156 @@
       </w:rPr>
     </w:lvl>
   </w:abstractNum>
-  <w:abstractNum w:abstractNumId="20" w15:restartNumberingAfterBreak="0">
+  <w:abstractNum w:abstractNumId="23" w15:restartNumberingAfterBreak="0">
+    <w:nsid w:val="6E806C19"/>
+    <w:multiLevelType w:val="multilevel"/>
+    <w:tmpl w:val="8C6CB086"/>
+    <w:lvl w:ilvl="0">
+      <w:start w:val="1"/>
+      <w:numFmt w:val="bullet"/>
+      <w:lvlText w:val=""/>
+      <w:lvlJc w:val="left"/>
+      <w:pPr>
+        <w:tabs>
+          <w:tab w:val="num" w:pos="720"/>
+        </w:tabs>
+        <w:ind w:left="720" w:hanging="360"/>
+      </w:pPr>
+      <w:rPr>
+        <w:rFonts w:ascii="Symbol" w:hAnsi="Symbol" w:hint="default"/>
+        <w:sz w:val="20"/>
+      </w:rPr>
+    </w:lvl>
+    <w:lvl w:ilvl="1" w:tentative="1">
+      <w:start w:val="1"/>
+      <w:numFmt w:val="bullet"/>
+      <w:lvlText w:val="o"/>
+      <w:lvlJc w:val="left"/>
+      <w:pPr>
+        <w:tabs>
+          <w:tab w:val="num" w:pos="1440"/>
+        </w:tabs>
+        <w:ind w:left="1440" w:hanging="360"/>
+      </w:pPr>
+      <w:rPr>
+        <w:rFonts w:ascii="Courier New" w:hAnsi="Courier New" w:hint="default"/>
+        <w:sz w:val="20"/>
+      </w:rPr>
+    </w:lvl>
+    <w:lvl w:ilvl="2" w:tentative="1">
+      <w:start w:val="1"/>
+      <w:numFmt w:val="bullet"/>
+      <w:lvlText w:val=""/>
+      <w:lvlJc w:val="left"/>
+      <w:pPr>
+        <w:tabs>
+          <w:tab w:val="num" w:pos="2160"/>
+        </w:tabs>
+        <w:ind w:left="2160" w:hanging="360"/>
+      </w:pPr>
+      <w:rPr>
+        <w:rFonts w:ascii="Wingdings" w:hAnsi="Wingdings" w:hint="default"/>
+        <w:sz w:val="20"/>
+      </w:rPr>
+    </w:lvl>
+    <w:lvl w:ilvl="3" w:tentative="1">
+      <w:start w:val="1"/>
+      <w:numFmt w:val="bullet"/>
+      <w:lvlText w:val=""/>
+      <w:lvlJc w:val="left"/>
+      <w:pPr>
+        <w:tabs>
+          <w:tab w:val="num" w:pos="2880"/>
+        </w:tabs>
+        <w:ind w:left="2880" w:hanging="360"/>
+      </w:pPr>
+      <w:rPr>
+        <w:rFonts w:ascii="Wingdings" w:hAnsi="Wingdings" w:hint="default"/>
+        <w:sz w:val="20"/>
+      </w:rPr>
+    </w:lvl>
+    <w:lvl w:ilvl="4" w:tentative="1">
+      <w:start w:val="1"/>
+      <w:numFmt w:val="bullet"/>
+      <w:lvlText w:val=""/>
+      <w:lvlJc w:val="left"/>
+      <w:pPr>
+        <w:tabs>
+          <w:tab w:val="num" w:pos="3600"/>
+        </w:tabs>
+        <w:ind w:left="3600" w:hanging="360"/>
+      </w:pPr>
+      <w:rPr>
+        <w:rFonts w:ascii="Wingdings" w:hAnsi="Wingdings" w:hint="default"/>
+        <w:sz w:val="20"/>
+      </w:rPr>
+    </w:lvl>
+    <w:lvl w:ilvl="5" w:tentative="1">
+      <w:start w:val="1"/>
+      <w:numFmt w:val="bullet"/>
+      <w:lvlText w:val=""/>
+      <w:lvlJc w:val="left"/>
+      <w:pPr>
+        <w:tabs>
+          <w:tab w:val="num" w:pos="4320"/>
+        </w:tabs>
+        <w:ind w:left="4320" w:hanging="360"/>
+      </w:pPr>
+      <w:rPr>
+        <w:rFonts w:ascii="Wingdings" w:hAnsi="Wingdings" w:hint="default"/>
+        <w:sz w:val="20"/>
+      </w:rPr>
+    </w:lvl>
+    <w:lvl w:ilvl="6" w:tentative="1">
+      <w:start w:val="1"/>
+      <w:numFmt w:val="bullet"/>
+      <w:lvlText w:val=""/>
+      <w:lvlJc w:val="left"/>
+      <w:pPr>
+        <w:tabs>
+          <w:tab w:val="num" w:pos="5040"/>
+        </w:tabs>
+        <w:ind w:left="5040" w:hanging="360"/>
+      </w:pPr>
+      <w:rPr>
+        <w:rFonts w:ascii="Wingdings" w:hAnsi="Wingdings" w:hint="default"/>
+        <w:sz w:val="20"/>
+      </w:rPr>
+    </w:lvl>
+    <w:lvl w:ilvl="7" w:tentative="1">
+      <w:start w:val="1"/>
+      <w:numFmt w:val="bullet"/>
+      <w:lvlText w:val=""/>
+      <w:lvlJc w:val="left"/>
+      <w:pPr>
+        <w:tabs>
+          <w:tab w:val="num" w:pos="5760"/>
+        </w:tabs>
+        <w:ind w:left="5760" w:hanging="360"/>
+      </w:pPr>
+      <w:rPr>
+        <w:rFonts w:ascii="Wingdings" w:hAnsi="Wingdings" w:hint="default"/>
+        <w:sz w:val="20"/>
+      </w:rPr>
+    </w:lvl>
+    <w:lvl w:ilvl="8" w:tentative="1">
+      <w:start w:val="1"/>
+      <w:numFmt w:val="bullet"/>
+      <w:lvlText w:val=""/>
+      <w:lvlJc w:val="left"/>
+      <w:pPr>
+        <w:tabs>
+          <w:tab w:val="num" w:pos="6480"/>
+        </w:tabs>
+        <w:ind w:left="6480" w:hanging="360"/>
+      </w:pPr>
+      <w:rPr>
+        <w:rFonts w:ascii="Wingdings" w:hAnsi="Wingdings" w:hint="default"/>
+        <w:sz w:val="20"/>
+      </w:rPr>
+    </w:lvl>
+  </w:abstractNum>
+  <w:abstractNum w:abstractNumId="24" w15:restartNumberingAfterBreak="0">
     <w:nsid w:val="716D3293"/>
     <w:multiLevelType w:val="multilevel"/>
     <w:tmpl w:val="ECB8E250"/>
@@ -5590,7 +7229,7 @@
       </w:rPr>
     </w:lvl>
   </w:abstractNum>
-  <w:abstractNum w:abstractNumId="21" w15:restartNumberingAfterBreak="0">
+  <w:abstractNum w:abstractNumId="25" w15:restartNumberingAfterBreak="0">
     <w:nsid w:val="7B780C84"/>
     <w:multiLevelType w:val="multilevel"/>
     <w:tmpl w:val="946C92E2"/>
@@ -5739,7 +7378,7 @@
       </w:rPr>
     </w:lvl>
   </w:abstractNum>
-  <w:abstractNum w:abstractNumId="22" w15:restartNumberingAfterBreak="0">
+  <w:abstractNum w:abstractNumId="26" w15:restartNumberingAfterBreak="0">
     <w:nsid w:val="7E6F3258"/>
     <w:multiLevelType w:val="multilevel"/>
     <w:tmpl w:val="448ABB7C"/>
@@ -5888,41 +7527,190 @@
       </w:rPr>
     </w:lvl>
   </w:abstractNum>
+  <w:abstractNum w:abstractNumId="27" w15:restartNumberingAfterBreak="0">
+    <w:nsid w:val="7ECD5976"/>
+    <w:multiLevelType w:val="multilevel"/>
+    <w:tmpl w:val="91480512"/>
+    <w:lvl w:ilvl="0">
+      <w:start w:val="1"/>
+      <w:numFmt w:val="bullet"/>
+      <w:lvlText w:val=""/>
+      <w:lvlJc w:val="left"/>
+      <w:pPr>
+        <w:tabs>
+          <w:tab w:val="num" w:pos="720"/>
+        </w:tabs>
+        <w:ind w:left="720" w:hanging="360"/>
+      </w:pPr>
+      <w:rPr>
+        <w:rFonts w:ascii="Symbol" w:hAnsi="Symbol" w:hint="default"/>
+        <w:sz w:val="20"/>
+      </w:rPr>
+    </w:lvl>
+    <w:lvl w:ilvl="1" w:tentative="1">
+      <w:start w:val="1"/>
+      <w:numFmt w:val="bullet"/>
+      <w:lvlText w:val="o"/>
+      <w:lvlJc w:val="left"/>
+      <w:pPr>
+        <w:tabs>
+          <w:tab w:val="num" w:pos="1440"/>
+        </w:tabs>
+        <w:ind w:left="1440" w:hanging="360"/>
+      </w:pPr>
+      <w:rPr>
+        <w:rFonts w:ascii="Courier New" w:hAnsi="Courier New" w:hint="default"/>
+        <w:sz w:val="20"/>
+      </w:rPr>
+    </w:lvl>
+    <w:lvl w:ilvl="2" w:tentative="1">
+      <w:start w:val="1"/>
+      <w:numFmt w:val="bullet"/>
+      <w:lvlText w:val=""/>
+      <w:lvlJc w:val="left"/>
+      <w:pPr>
+        <w:tabs>
+          <w:tab w:val="num" w:pos="2160"/>
+        </w:tabs>
+        <w:ind w:left="2160" w:hanging="360"/>
+      </w:pPr>
+      <w:rPr>
+        <w:rFonts w:ascii="Wingdings" w:hAnsi="Wingdings" w:hint="default"/>
+        <w:sz w:val="20"/>
+      </w:rPr>
+    </w:lvl>
+    <w:lvl w:ilvl="3" w:tentative="1">
+      <w:start w:val="1"/>
+      <w:numFmt w:val="bullet"/>
+      <w:lvlText w:val=""/>
+      <w:lvlJc w:val="left"/>
+      <w:pPr>
+        <w:tabs>
+          <w:tab w:val="num" w:pos="2880"/>
+        </w:tabs>
+        <w:ind w:left="2880" w:hanging="360"/>
+      </w:pPr>
+      <w:rPr>
+        <w:rFonts w:ascii="Wingdings" w:hAnsi="Wingdings" w:hint="default"/>
+        <w:sz w:val="20"/>
+      </w:rPr>
+    </w:lvl>
+    <w:lvl w:ilvl="4" w:tentative="1">
+      <w:start w:val="1"/>
+      <w:numFmt w:val="bullet"/>
+      <w:lvlText w:val=""/>
+      <w:lvlJc w:val="left"/>
+      <w:pPr>
+        <w:tabs>
+          <w:tab w:val="num" w:pos="3600"/>
+        </w:tabs>
+        <w:ind w:left="3600" w:hanging="360"/>
+      </w:pPr>
+      <w:rPr>
+        <w:rFonts w:ascii="Wingdings" w:hAnsi="Wingdings" w:hint="default"/>
+        <w:sz w:val="20"/>
+      </w:rPr>
+    </w:lvl>
+    <w:lvl w:ilvl="5" w:tentative="1">
+      <w:start w:val="1"/>
+      <w:numFmt w:val="bullet"/>
+      <w:lvlText w:val=""/>
+      <w:lvlJc w:val="left"/>
+      <w:pPr>
+        <w:tabs>
+          <w:tab w:val="num" w:pos="4320"/>
+        </w:tabs>
+        <w:ind w:left="4320" w:hanging="360"/>
+      </w:pPr>
+      <w:rPr>
+        <w:rFonts w:ascii="Wingdings" w:hAnsi="Wingdings" w:hint="default"/>
+        <w:sz w:val="20"/>
+      </w:rPr>
+    </w:lvl>
+    <w:lvl w:ilvl="6" w:tentative="1">
+      <w:start w:val="1"/>
+      <w:numFmt w:val="bullet"/>
+      <w:lvlText w:val=""/>
+      <w:lvlJc w:val="left"/>
+      <w:pPr>
+        <w:tabs>
+          <w:tab w:val="num" w:pos="5040"/>
+        </w:tabs>
+        <w:ind w:left="5040" w:hanging="360"/>
+      </w:pPr>
+      <w:rPr>
+        <w:rFonts w:ascii="Wingdings" w:hAnsi="Wingdings" w:hint="default"/>
+        <w:sz w:val="20"/>
+      </w:rPr>
+    </w:lvl>
+    <w:lvl w:ilvl="7" w:tentative="1">
+      <w:start w:val="1"/>
+      <w:numFmt w:val="bullet"/>
+      <w:lvlText w:val=""/>
+      <w:lvlJc w:val="left"/>
+      <w:pPr>
+        <w:tabs>
+          <w:tab w:val="num" w:pos="5760"/>
+        </w:tabs>
+        <w:ind w:left="5760" w:hanging="360"/>
+      </w:pPr>
+      <w:rPr>
+        <w:rFonts w:ascii="Wingdings" w:hAnsi="Wingdings" w:hint="default"/>
+        <w:sz w:val="20"/>
+      </w:rPr>
+    </w:lvl>
+    <w:lvl w:ilvl="8" w:tentative="1">
+      <w:start w:val="1"/>
+      <w:numFmt w:val="bullet"/>
+      <w:lvlText w:val=""/>
+      <w:lvlJc w:val="left"/>
+      <w:pPr>
+        <w:tabs>
+          <w:tab w:val="num" w:pos="6480"/>
+        </w:tabs>
+        <w:ind w:left="6480" w:hanging="360"/>
+      </w:pPr>
+      <w:rPr>
+        <w:rFonts w:ascii="Wingdings" w:hAnsi="Wingdings" w:hint="default"/>
+        <w:sz w:val="20"/>
+      </w:rPr>
+    </w:lvl>
+  </w:abstractNum>
   <w:num w:numId="1" w16cid:durableId="899360437">
+    <w:abstractNumId w:val="5"/>
+  </w:num>
+  <w:num w:numId="2" w16cid:durableId="1156726499">
+    <w:abstractNumId w:val="9"/>
+  </w:num>
+  <w:num w:numId="3" w16cid:durableId="215629056">
+    <w:abstractNumId w:val="14"/>
+  </w:num>
+  <w:num w:numId="4" w16cid:durableId="1685747018">
+    <w:abstractNumId w:val="20"/>
+  </w:num>
+  <w:num w:numId="5" w16cid:durableId="805437558">
+    <w:abstractNumId w:val="25"/>
+  </w:num>
+  <w:num w:numId="6" w16cid:durableId="715929254">
+    <w:abstractNumId w:val="17"/>
+  </w:num>
+  <w:num w:numId="7" w16cid:durableId="411508697">
+    <w:abstractNumId w:val="13"/>
+  </w:num>
+  <w:num w:numId="8" w16cid:durableId="469516158">
+    <w:abstractNumId w:val="26"/>
+  </w:num>
+  <w:num w:numId="9" w16cid:durableId="703216388">
     <w:abstractNumId w:val="4"/>
   </w:num>
-  <w:num w:numId="2" w16cid:durableId="1156726499">
-    <w:abstractNumId w:val="6"/>
-  </w:num>
-  <w:num w:numId="3" w16cid:durableId="215629056">
-    <w:abstractNumId w:val="11"/>
-  </w:num>
-  <w:num w:numId="4" w16cid:durableId="1685747018">
-    <w:abstractNumId w:val="17"/>
-  </w:num>
-  <w:num w:numId="5" w16cid:durableId="805437558">
-    <w:abstractNumId w:val="21"/>
-  </w:num>
-  <w:num w:numId="6" w16cid:durableId="715929254">
-    <w:abstractNumId w:val="14"/>
-  </w:num>
-  <w:num w:numId="7" w16cid:durableId="411508697">
-    <w:abstractNumId w:val="10"/>
-  </w:num>
-  <w:num w:numId="8" w16cid:durableId="469516158">
-    <w:abstractNumId w:val="22"/>
-  </w:num>
-  <w:num w:numId="9" w16cid:durableId="703216388">
-    <w:abstractNumId w:val="3"/>
-  </w:num>
   <w:num w:numId="10" w16cid:durableId="303045377">
-    <w:abstractNumId w:val="13"/>
+    <w:abstractNumId w:val="16"/>
   </w:num>
   <w:num w:numId="11" w16cid:durableId="1331636080">
-    <w:abstractNumId w:val="9"/>
+    <w:abstractNumId w:val="12"/>
   </w:num>
   <w:num w:numId="12" w16cid:durableId="1172257662">
-    <w:abstractNumId w:val="5"/>
+    <w:abstractNumId w:val="6"/>
   </w:num>
   <w:num w:numId="13" w16cid:durableId="1930894147">
     <w:abstractNumId w:val="1"/>
@@ -5931,30 +7719,45 @@
     <w:abstractNumId w:val="0"/>
   </w:num>
   <w:num w:numId="15" w16cid:durableId="397361948">
-    <w:abstractNumId w:val="12"/>
+    <w:abstractNumId w:val="15"/>
   </w:num>
   <w:num w:numId="16" w16cid:durableId="1123424669">
-    <w:abstractNumId w:val="16"/>
+    <w:abstractNumId w:val="19"/>
   </w:num>
   <w:num w:numId="17" w16cid:durableId="281883427">
-    <w:abstractNumId w:val="15"/>
+    <w:abstractNumId w:val="18"/>
   </w:num>
   <w:num w:numId="18" w16cid:durableId="2033339128">
+    <w:abstractNumId w:val="3"/>
+  </w:num>
+  <w:num w:numId="19" w16cid:durableId="1013461984">
+    <w:abstractNumId w:val="21"/>
+  </w:num>
+  <w:num w:numId="20" w16cid:durableId="2052067455">
+    <w:abstractNumId w:val="22"/>
+  </w:num>
+  <w:num w:numId="21" w16cid:durableId="339696575">
+    <w:abstractNumId w:val="10"/>
+  </w:num>
+  <w:num w:numId="22" w16cid:durableId="1634873201">
+    <w:abstractNumId w:val="24"/>
+  </w:num>
+  <w:num w:numId="23" w16cid:durableId="29303825">
+    <w:abstractNumId w:val="11"/>
+  </w:num>
+  <w:num w:numId="24" w16cid:durableId="1738361116">
+    <w:abstractNumId w:val="27"/>
+  </w:num>
+  <w:num w:numId="25" w16cid:durableId="1337076238">
+    <w:abstractNumId w:val="23"/>
+  </w:num>
+  <w:num w:numId="26" w16cid:durableId="696850032">
+    <w:abstractNumId w:val="7"/>
+  </w:num>
+  <w:num w:numId="27" w16cid:durableId="161433612">
     <w:abstractNumId w:val="2"/>
   </w:num>
-  <w:num w:numId="19" w16cid:durableId="1013461984">
-    <w:abstractNumId w:val="18"/>
-  </w:num>
-  <w:num w:numId="20" w16cid:durableId="2052067455">
-    <w:abstractNumId w:val="19"/>
-  </w:num>
-  <w:num w:numId="21" w16cid:durableId="339696575">
-    <w:abstractNumId w:val="7"/>
-  </w:num>
-  <w:num w:numId="22" w16cid:durableId="1634873201">
-    <w:abstractNumId w:val="20"/>
-  </w:num>
-  <w:num w:numId="23" w16cid:durableId="29303825">
+  <w:num w:numId="28" w16cid:durableId="1324310442">
     <w:abstractNumId w:val="8"/>
   </w:num>
 </w:numbering>

</xml_diff>